<commit_message>
Full book RC1: edited master from Manuscript, ch.14 + appendix structure, logged unit fixes, Afghan-Dari orthography pass, note/figure boxes, LTR lab tables, RTL EPUB (epubcheck clean), PDF/DOCX; author queries
Co-authored-by: arena-agent <297053741+arena-agent@users.noreply.github.com>
</commit_message>
<xml_diff>
--- a/clinical-methods-ali/reference.docx
+++ b/clinical-methods-ali/reference.docx
@@ -1140,6 +1140,43 @@
       <w:b w:val="0"/>
       <w:bCs w:val="0"/>
       <w:color w:val="365F91" w:themeColor="accent1" w:themeShade="BF"/>
+    </w:rPr>
+  </w:style>
+  <w:style w:type="paragraph" w:customStyle="1" w:styleId="Note">
+    <w:name w:val="Note"/>
+    <w:basedOn w:val="BodyText"/>
+    <w:qFormat/>
+    <w:pPr>
+      <w:pBdr>
+        <w:right w:val="single" w:sz="24" w:space="6" w:color="B8913A"/>
+      </w:pBdr>
+      <w:shd w:val="clear" w:color="auto" w:fill="FBF6EA"/>
+      <w:bidi/>
+      <w:spacing w:before="120" w:after="120"/>
+      <w:ind w:right="113" w:left="113"/>
+    </w:pPr>
+    <w:rPr>
+      <w:rtl/>
+    </w:rPr>
+  </w:style>
+  <w:style w:type="paragraph" w:customStyle="1" w:styleId="FigurePlaceholder">
+    <w:name w:val="Figure Placeholder"/>
+    <w:basedOn w:val="BodyText"/>
+    <w:qFormat/>
+    <w:pPr>
+      <w:pBdr>
+        <w:top w:val="dashed" w:sz="4" w:space="4" w:color="9FB8BB"/>
+        <w:bottom w:val="dashed" w:sz="4" w:space="4" w:color="9FB8BB"/>
+        <w:left w:val="dashed" w:sz="4" w:space="4" w:color="9FB8BB"/>
+        <w:right w:val="dashed" w:sz="4" w:space="4" w:color="9FB8BB"/>
+      </w:pBdr>
+      <w:bidi/>
+      <w:jc w:val="center"/>
+    </w:pPr>
+    <w:rPr>
+      <w:rtl/>
+      <w:color w:val="136F73"/>
+      <w:sz w:val="18"/>
     </w:rPr>
   </w:style>
 </w:styles>

</xml_diff>

<commit_message>
v1.1: language pass (28 rewrites, style normalisation), 3 sourced medical fixes, chapter objectives/key points/self-tests + answers appendix, five-perspective evaluation
Co-authored-by: arena-agent <297053741+arena-agent@users.noreply.github.com>
</commit_message>
<xml_diff>
--- a/clinical-methods-ali/reference.docx
+++ b/clinical-methods-ali/reference.docx
@@ -1177,6 +1177,57 @@
       <w:rtl/>
       <w:color w:val="136F73"/>
       <w:sz w:val="18"/>
+    </w:rPr>
+  </w:style>
+  <w:style w:type="paragraph" w:customStyle="1" w:styleId="Objectives">
+    <w:name w:val="Objectives"/>
+    <w:basedOn w:val="BodyText"/>
+    <w:qFormat/>
+    <w:pPr>
+      <w:pBdr>
+        <w:right w:val="single" w:sz="24" w:space="6" w:color="136F73"/>
+      </w:pBdr>
+      <w:shd w:val="clear" w:color="auto" w:fill="FBF6EA"/>
+      <w:bidi/>
+      <w:spacing w:before="120" w:after="120"/>
+      <w:ind w:right="113" w:left="113"/>
+    </w:pPr>
+    <w:rPr>
+      <w:rtl/>
+    </w:rPr>
+  </w:style>
+  <w:style w:type="paragraph" w:customStyle="1" w:styleId="KeyPoints">
+    <w:name w:val="Key Points"/>
+    <w:basedOn w:val="BodyText"/>
+    <w:qFormat/>
+    <w:pPr>
+      <w:pBdr>
+        <w:right w:val="single" w:sz="24" w:space="6" w:color="0F2744"/>
+      </w:pBdr>
+      <w:shd w:val="clear" w:color="auto" w:fill="FBF6EA"/>
+      <w:bidi/>
+      <w:spacing w:before="120" w:after="120"/>
+      <w:ind w:right="113" w:left="113"/>
+    </w:pPr>
+    <w:rPr>
+      <w:rtl/>
+    </w:rPr>
+  </w:style>
+  <w:style w:type="paragraph" w:customStyle="1" w:styleId="SelfTest">
+    <w:name w:val="Self Test"/>
+    <w:basedOn w:val="BodyText"/>
+    <w:qFormat/>
+    <w:pPr>
+      <w:pBdr>
+        <w:right w:val="single" w:sz="24" w:space="6" w:color="B8913A"/>
+      </w:pBdr>
+      <w:shd w:val="clear" w:color="auto" w:fill="FBF6EA"/>
+      <w:bidi/>
+      <w:spacing w:before="120" w:after="120"/>
+      <w:ind w:right="113" w:left="113"/>
+    </w:pPr>
+    <w:rPr>
+      <w:rtl/>
     </w:rPr>
   </w:style>
 </w:styles>

</xml_diff>

<commit_message>
v1.2: full verb-register pass (1350), 46 more sentence rewrites, red flags + clinical cases in all chapters, 5 algorithms, ABCDE/NEWS2/POCUS section, glossary, subject index, references, how-to-use guide; evaluation updated (avg 8.9)
Co-authored-by: arena-agent <297053741+arena-agent@users.noreply.github.com>
</commit_message>
<xml_diff>
--- a/clinical-methods-ali/reference.docx
+++ b/clinical-methods-ali/reference.docx
@@ -1220,6 +1220,40 @@
     <w:pPr>
       <w:pBdr>
         <w:right w:val="single" w:sz="24" w:space="6" w:color="B8913A"/>
+      </w:pBdr>
+      <w:shd w:val="clear" w:color="auto" w:fill="FBF6EA"/>
+      <w:bidi/>
+      <w:spacing w:before="120" w:after="120"/>
+      <w:ind w:right="113" w:left="113"/>
+    </w:pPr>
+    <w:rPr>
+      <w:rtl/>
+    </w:rPr>
+  </w:style>
+  <w:style w:type="paragraph" w:customStyle="1" w:styleId="RedFlags">
+    <w:name w:val="Red Flags"/>
+    <w:basedOn w:val="BodyText"/>
+    <w:qFormat/>
+    <w:pPr>
+      <w:pBdr>
+        <w:right w:val="single" w:sz="24" w:space="6" w:color="B3261E"/>
+      </w:pBdr>
+      <w:shd w:val="clear" w:color="auto" w:fill="FBF6EA"/>
+      <w:bidi/>
+      <w:spacing w:before="120" w:after="120"/>
+      <w:ind w:right="113" w:left="113"/>
+    </w:pPr>
+    <w:rPr>
+      <w:rtl/>
+    </w:rPr>
+  </w:style>
+  <w:style w:type="paragraph" w:customStyle="1" w:styleId="ClinicalCase">
+    <w:name w:val="Clinical Case"/>
+    <w:basedOn w:val="BodyText"/>
+    <w:qFormat/>
+    <w:pPr>
+      <w:pBdr>
+        <w:right w:val="single" w:sz="24" w:space="6" w:color="5B4A9E"/>
       </w:pBdr>
       <w:shd w:val="clear" w:color="auto" w:fill="FBF6EA"/>
       <w:bidi/>

</xml_diff>